<commit_message>
Revise resume: linked projects, summary and title wording
- Add linked entries for the modal/epistemic logic primer and the
  Science & Machine Intelligence newsletter in Selected AI Projects.
- Summary now says 15+ years of experience.
- Add astronomer / scientific programmer wording to the first bullets of
  the Kepler and JPL roles; official job titles are unchanged.
- Tighten spacing and a few bullets to keep the resume at two pages.

Co-Authored-By: Claude Sonnet 5.5 <noreply@anthropic.com>
</commit_message>
<xml_diff>
--- a/Joseph-Catanzarite-Resume-15Oct2026.docx
+++ b/Joseph-Catanzarite-Resume-15Oct2026.docx
@@ -123,7 +123,7 @@
       <w:pPr>
         <w:pStyle w:val="Heading1"/>
         <w:keepNext/>
-        <w:spacing w:before="130" w:after="45" w:line="246" w:lineRule="auto"/>
+        <w:spacing w:before="110" w:after="40" w:line="240" w:lineRule="auto"/>
       </w:pPr>
       <w:r>
         <w:rPr>
@@ -138,20 +138,20 @@
     </w:p>
     <w:p>
       <w:pPr>
-        <w:spacing w:before="0" w:after="0" w:line="246" w:lineRule="auto"/>
-      </w:pPr>
-      <w:r>
-        <w:rPr>
-          <w:rFonts w:ascii="Calibri" w:hAnsi="Calibri" w:cs="Calibri"/>
-        </w:rPr>
-        <w:t xml:space="preserve">AI researcher and data scientist with 30+ years of experience applying machine learning, Bayesian statistics, and scientific computing to NASA missions and to teaching. Built a Random Forest classifier (97% accuracy) for Kepler exoplanet candidate vetting, published in NASA’s DR24 catalog; led JPL’s analysis team in a five-team double-blind exoplanet detection test. Completing an M.S. in Artificial Intelligence at Johns Hopkins (expected 2028) with hands-on work in large language models (LLMs), generative AI, and AI agents. Author of peer-reviewed astrophysics papers (~5,900 citations, h-index 32). Experienced instructor and research mentor in deep learning, data science, physics, and astronomy.</w:t>
+        <w:spacing w:before="0" w:after="0" w:line="240" w:lineRule="auto"/>
+      </w:pPr>
+      <w:r>
+        <w:rPr>
+          <w:rFonts w:ascii="Calibri" w:hAnsi="Calibri" w:cs="Calibri"/>
+        </w:rPr>
+        <w:t xml:space="preserve">AI researcher and data scientist with 15+ years of experience applying machine learning, Bayesian statistics, and scientific computing to NASA missions and teaching. Built a Random Forest classifier (97% accuracy) for Kepler exoplanet candidate vetting, published in NASA’s DR24 catalog; led JPL’s analysis team in a five-team double-blind exoplanet detection test. Completing an M.S. in Artificial Intelligence at Johns Hopkins (expected 2028) with hands-on work in large language models (LLMs), generative AI, and AI agents. Author of peer-reviewed astrophysics papers (~5,900 citations, h-index 32). Instructor and research mentor in AI, data science, physics, and astronomy.</w:t>
       </w:r>
     </w:p>
     <w:p>
       <w:pPr>
         <w:pStyle w:val="Heading1"/>
         <w:keepNext/>
-        <w:spacing w:before="130" w:after="45" w:line="246" w:lineRule="auto"/>
+        <w:spacing w:before="110" w:after="40" w:line="240" w:lineRule="auto"/>
       </w:pPr>
       <w:r>
         <w:rPr>
@@ -166,7 +166,7 @@
     </w:p>
     <w:p>
       <w:pPr>
-        <w:spacing w:before="0" w:after="12" w:line="246" w:lineRule="auto"/>
+        <w:spacing w:before="0" w:after="12" w:line="240" w:lineRule="auto"/>
       </w:pPr>
       <w:r>
         <w:rPr>
@@ -184,7 +184,7 @@
     </w:p>
     <w:p>
       <w:pPr>
-        <w:spacing w:before="0" w:after="12" w:line="246" w:lineRule="auto"/>
+        <w:spacing w:before="0" w:after="12" w:line="240" w:lineRule="auto"/>
       </w:pPr>
       <w:r>
         <w:rPr>
@@ -202,7 +202,7 @@
     </w:p>
     <w:p>
       <w:pPr>
-        <w:spacing w:before="0" w:after="12" w:line="246" w:lineRule="auto"/>
+        <w:spacing w:before="0" w:after="12" w:line="240" w:lineRule="auto"/>
       </w:pPr>
       <w:r>
         <w:rPr>
@@ -220,7 +220,7 @@
     </w:p>
     <w:p>
       <w:pPr>
-        <w:spacing w:before="0" w:after="12" w:line="246" w:lineRule="auto"/>
+        <w:spacing w:before="0" w:after="12" w:line="240" w:lineRule="auto"/>
       </w:pPr>
       <w:r>
         <w:rPr>
@@ -238,7 +238,7 @@
     </w:p>
     <w:p>
       <w:pPr>
-        <w:spacing w:before="0" w:after="12" w:line="246" w:lineRule="auto"/>
+        <w:spacing w:before="0" w:after="12" w:line="240" w:lineRule="auto"/>
       </w:pPr>
       <w:r>
         <w:rPr>
@@ -258,7 +258,7 @@
       <w:pPr>
         <w:pStyle w:val="Heading1"/>
         <w:keepNext/>
-        <w:spacing w:before="130" w:after="45" w:line="246" w:lineRule="auto"/>
+        <w:spacing w:before="110" w:after="40" w:line="240" w:lineRule="auto"/>
       </w:pPr>
       <w:r>
         <w:rPr>
@@ -277,7 +277,7 @@
         <w:tabs>
           <w:tab w:val="right" w:pos="10512"/>
         </w:tabs>
-        <w:spacing w:before="60" w:after="10" w:line="246" w:lineRule="auto"/>
+        <w:spacing w:before="50" w:after="10" w:line="240" w:lineRule="auto"/>
       </w:pPr>
       <w:r>
         <w:rPr>
@@ -316,7 +316,7 @@
           <w:ilvl w:val="0"/>
           <w:numId w:val="1"/>
         </w:numPr>
-        <w:spacing w:before="0" w:after="8" w:line="246" w:lineRule="auto"/>
+        <w:spacing w:before="0" w:after="8" w:line="240" w:lineRule="auto"/>
       </w:pPr>
       <w:r>
         <w:rPr>
@@ -331,7 +331,7 @@
         <w:tabs>
           <w:tab w:val="right" w:pos="10512"/>
         </w:tabs>
-        <w:spacing w:before="60" w:after="10" w:line="246" w:lineRule="auto"/>
+        <w:spacing w:before="50" w:after="10" w:line="240" w:lineRule="auto"/>
       </w:pPr>
       <w:r>
         <w:rPr>
@@ -370,7 +370,7 @@
           <w:ilvl w:val="0"/>
           <w:numId w:val="1"/>
         </w:numPr>
-        <w:spacing w:before="0" w:after="8" w:line="246" w:lineRule="auto"/>
+        <w:spacing w:before="0" w:after="8" w:line="240" w:lineRule="auto"/>
       </w:pPr>
       <w:r>
         <w:rPr>
@@ -385,7 +385,7 @@
         <w:tabs>
           <w:tab w:val="right" w:pos="10512"/>
         </w:tabs>
-        <w:spacing w:before="60" w:after="10" w:line="246" w:lineRule="auto"/>
+        <w:spacing w:before="50" w:after="10" w:line="240" w:lineRule="auto"/>
       </w:pPr>
       <w:r>
         <w:rPr>
@@ -424,7 +424,7 @@
           <w:ilvl w:val="0"/>
           <w:numId w:val="1"/>
         </w:numPr>
-        <w:spacing w:before="0" w:after="8" w:line="246" w:lineRule="auto"/>
+        <w:spacing w:before="0" w:after="8" w:line="240" w:lineRule="auto"/>
       </w:pPr>
       <w:r>
         <w:rPr>
@@ -439,7 +439,7 @@
         <w:tabs>
           <w:tab w:val="right" w:pos="10512"/>
         </w:tabs>
-        <w:spacing w:before="60" w:after="10" w:line="246" w:lineRule="auto"/>
+        <w:spacing w:before="50" w:after="10" w:line="240" w:lineRule="auto"/>
       </w:pPr>
       <w:r>
         <w:rPr>
@@ -471,7 +471,7 @@
         <w:tabs>
           <w:tab w:val="right" w:pos="10512"/>
         </w:tabs>
-        <w:spacing w:before="60" w:after="10" w:line="246" w:lineRule="auto"/>
+        <w:spacing w:before="50" w:after="10" w:line="240" w:lineRule="auto"/>
       </w:pPr>
       <w:r>
         <w:rPr>
@@ -510,7 +510,7 @@
           <w:ilvl w:val="0"/>
           <w:numId w:val="1"/>
         </w:numPr>
-        <w:spacing w:before="0" w:after="8" w:line="246" w:lineRule="auto"/>
+        <w:spacing w:before="0" w:after="8" w:line="240" w:lineRule="auto"/>
       </w:pPr>
       <w:r>
         <w:rPr>
@@ -525,7 +525,7 @@
         <w:tabs>
           <w:tab w:val="right" w:pos="10512"/>
         </w:tabs>
-        <w:spacing w:before="60" w:after="10" w:line="246" w:lineRule="auto"/>
+        <w:spacing w:before="50" w:after="10" w:line="240" w:lineRule="auto"/>
       </w:pPr>
       <w:r>
         <w:rPr>
@@ -564,7 +564,7 @@
           <w:ilvl w:val="0"/>
           <w:numId w:val="1"/>
         </w:numPr>
-        <w:spacing w:before="0" w:after="8" w:line="246" w:lineRule="auto"/>
+        <w:spacing w:before="0" w:after="8" w:line="240" w:lineRule="auto"/>
       </w:pPr>
       <w:r>
         <w:rPr>
@@ -579,7 +579,7 @@
         <w:tabs>
           <w:tab w:val="right" w:pos="10512"/>
         </w:tabs>
-        <w:spacing w:before="60" w:after="10" w:line="246" w:lineRule="auto"/>
+        <w:spacing w:before="50" w:after="10" w:line="240" w:lineRule="auto"/>
       </w:pPr>
       <w:r>
         <w:rPr>
@@ -611,7 +611,7 @@
           <w:ilvl w:val="0"/>
           <w:numId w:val="1"/>
         </w:numPr>
-        <w:spacing w:before="0" w:after="8" w:line="246" w:lineRule="auto"/>
+        <w:spacing w:before="0" w:after="8" w:line="240" w:lineRule="auto"/>
       </w:pPr>
       <w:r>
         <w:rPr>
@@ -633,7 +633,7 @@
           <w:ilvl w:val="0"/>
           <w:numId w:val="1"/>
         </w:numPr>
-        <w:spacing w:before="0" w:after="8" w:line="246" w:lineRule="auto"/>
+        <w:spacing w:before="0" w:after="8" w:line="240" w:lineRule="auto"/>
       </w:pPr>
       <w:r>
         <w:rPr>
@@ -655,7 +655,7 @@
           <w:ilvl w:val="0"/>
           <w:numId w:val="1"/>
         </w:numPr>
-        <w:spacing w:before="0" w:after="8" w:line="246" w:lineRule="auto"/>
+        <w:spacing w:before="0" w:after="8" w:line="240" w:lineRule="auto"/>
       </w:pPr>
       <w:r>
         <w:rPr>
@@ -677,7 +677,7 @@
         <w:tabs>
           <w:tab w:val="right" w:pos="10512"/>
         </w:tabs>
-        <w:spacing w:before="60" w:after="10" w:line="246" w:lineRule="auto"/>
+        <w:spacing w:before="50" w:after="10" w:line="240" w:lineRule="auto"/>
       </w:pPr>
       <w:r>
         <w:rPr>
@@ -716,22 +716,22 @@
           <w:ilvl w:val="0"/>
           <w:numId w:val="1"/>
         </w:numPr>
-        <w:spacing w:before="0" w:after="8" w:line="246" w:lineRule="auto"/>
-      </w:pPr>
-      <w:r>
-        <w:rPr>
-          <w:rFonts w:ascii="Calibri" w:hAnsi="Calibri" w:cs="Calibri"/>
-        </w:rPr>
-        <w:t xml:space="preserve">Built a Random Forest “autovetter” that classifies Kepler exoplanet candidates with 97% accuracy; results published in NASA’s Kepler DR24 catalog and documented in “Autovetter Planet Candidate Catalog for Q1–Q17 Data Release 24.”</w:t>
-      </w:r>
-    </w:p>
-    <w:p>
-      <w:pPr>
-        <w:numPr>
-          <w:ilvl w:val="0"/>
-          <w:numId w:val="1"/>
-        </w:numPr>
-        <w:spacing w:before="0" w:after="8" w:line="246" w:lineRule="auto"/>
+        <w:spacing w:before="0" w:after="8" w:line="240" w:lineRule="auto"/>
+      </w:pPr>
+      <w:r>
+        <w:rPr>
+          <w:rFonts w:ascii="Calibri" w:hAnsi="Calibri" w:cs="Calibri"/>
+        </w:rPr>
+        <w:t xml:space="preserve">As astronomer and scientific programmer, built a Random Forest “autovetter” that classifies Kepler exoplanet candidates with 97% accuracy; published in NASA’s Kepler DR24 catalog and documented in the Autovetter Planet Candidate Catalog report.</w:t>
+      </w:r>
+    </w:p>
+    <w:p>
+      <w:pPr>
+        <w:numPr>
+          <w:ilvl w:val="0"/>
+          <w:numId w:val="1"/>
+        </w:numPr>
+        <w:spacing w:before="0" w:after="8" w:line="240" w:lineRule="auto"/>
       </w:pPr>
       <w:r>
         <w:rPr>
@@ -746,7 +746,7 @@
           <w:ilvl w:val="0"/>
           <w:numId w:val="1"/>
         </w:numPr>
-        <w:spacing w:before="0" w:after="8" w:line="246" w:lineRule="auto"/>
+        <w:spacing w:before="0" w:after="8" w:line="240" w:lineRule="auto"/>
       </w:pPr>
       <w:r>
         <w:rPr>
@@ -761,7 +761,7 @@
         <w:tabs>
           <w:tab w:val="right" w:pos="10512"/>
         </w:tabs>
-        <w:spacing w:before="60" w:after="10" w:line="246" w:lineRule="auto"/>
+        <w:spacing w:before="50" w:after="10" w:line="240" w:lineRule="auto"/>
       </w:pPr>
       <w:r>
         <w:rPr>
@@ -800,22 +800,22 @@
           <w:ilvl w:val="0"/>
           <w:numId w:val="1"/>
         </w:numPr>
-        <w:spacing w:before="0" w:after="8" w:line="246" w:lineRule="auto"/>
-      </w:pPr>
-      <w:r>
-        <w:rPr>
-          <w:rFonts w:ascii="Calibri" w:hAnsi="Calibri" w:cs="Calibri"/>
-        </w:rPr>
-        <w:t xml:space="preserve">Led JPL’s Analysis Team in NASA’s double-blind test for the Space Interferometry Mission (SIM), Phases 1 and 2, coordinating five teams to reach consensus solutions for planet masses and orbits in multi-planet systems from joint astrometric and radial velocity data.</w:t>
-      </w:r>
-    </w:p>
-    <w:p>
-      <w:pPr>
-        <w:numPr>
-          <w:ilvl w:val="0"/>
-          <w:numId w:val="1"/>
-        </w:numPr>
-        <w:spacing w:before="0" w:after="8" w:line="246" w:lineRule="auto"/>
+        <w:spacing w:before="0" w:after="8" w:line="240" w:lineRule="auto"/>
+      </w:pPr>
+      <w:r>
+        <w:rPr>
+          <w:rFonts w:ascii="Calibri" w:hAnsi="Calibri" w:cs="Calibri"/>
+        </w:rPr>
+        <w:t xml:space="preserve">As an astronomer on the SIM planet-finding team, led JPL’s Analysis Team in NASA’s double-blind test for the Space Interferometry Mission (SIM), coordinating five teams to reach consensus solutions for planet masses and orbits from joint astrometric and radial velocity data.</w:t>
+      </w:r>
+    </w:p>
+    <w:p>
+      <w:pPr>
+        <w:numPr>
+          <w:ilvl w:val="0"/>
+          <w:numId w:val="1"/>
+        </w:numPr>
+        <w:spacing w:before="0" w:after="8" w:line="240" w:lineRule="auto"/>
       </w:pPr>
       <w:r>
         <w:rPr>
@@ -830,7 +830,7 @@
           <w:ilvl w:val="0"/>
           <w:numId w:val="1"/>
         </w:numPr>
-        <w:spacing w:before="0" w:after="8" w:line="246" w:lineRule="auto"/>
+        <w:spacing w:before="0" w:after="8" w:line="240" w:lineRule="auto"/>
       </w:pPr>
       <w:r>
         <w:rPr>
@@ -845,7 +845,7 @@
         <w:tabs>
           <w:tab w:val="right" w:pos="10512"/>
         </w:tabs>
-        <w:spacing w:before="60" w:after="10" w:line="246" w:lineRule="auto"/>
+        <w:spacing w:before="50" w:after="10" w:line="240" w:lineRule="auto"/>
       </w:pPr>
       <w:r>
         <w:rPr>
@@ -884,7 +884,7 @@
           <w:ilvl w:val="0"/>
           <w:numId w:val="1"/>
         </w:numPr>
-        <w:spacing w:before="0" w:after="8" w:line="246" w:lineRule="auto"/>
+        <w:spacing w:before="0" w:after="8" w:line="240" w:lineRule="auto"/>
       </w:pPr>
       <w:r>
         <w:rPr>
@@ -899,7 +899,7 @@
         <w:tabs>
           <w:tab w:val="right" w:pos="10512"/>
         </w:tabs>
-        <w:spacing w:before="60" w:after="10" w:line="246" w:lineRule="auto"/>
+        <w:spacing w:before="50" w:after="10" w:line="240" w:lineRule="auto"/>
       </w:pPr>
       <w:r>
         <w:rPr>
@@ -938,7 +938,7 @@
           <w:ilvl w:val="0"/>
           <w:numId w:val="1"/>
         </w:numPr>
-        <w:spacing w:before="0" w:after="8" w:line="246" w:lineRule="auto"/>
+        <w:spacing w:before="0" w:after="8" w:line="240" w:lineRule="auto"/>
       </w:pPr>
       <w:r>
         <w:rPr>
@@ -951,7 +951,7 @@
       <w:pPr>
         <w:pStyle w:val="Heading1"/>
         <w:keepNext/>
-        <w:spacing w:before="130" w:after="45" w:line="246" w:lineRule="auto"/>
+        <w:spacing w:before="110" w:after="40" w:line="240" w:lineRule="auto"/>
       </w:pPr>
       <w:r>
         <w:rPr>
@@ -970,7 +970,7 @@
         <w:tabs>
           <w:tab w:val="right" w:pos="10512"/>
         </w:tabs>
-        <w:spacing w:before="40" w:after="10" w:line="246" w:lineRule="auto"/>
+        <w:spacing w:before="40" w:after="10" w:line="240" w:lineRule="auto"/>
       </w:pPr>
       <w:r>
         <w:rPr>
@@ -1012,7 +1012,7 @@
           <w:ilvl w:val="0"/>
           <w:numId w:val="1"/>
         </w:numPr>
-        <w:spacing w:before="0" w:after="8" w:line="246" w:lineRule="auto"/>
+        <w:spacing w:before="0" w:after="8" w:line="240" w:lineRule="auto"/>
       </w:pPr>
       <w:r>
         <w:rPr>
@@ -1027,7 +1027,7 @@
         <w:tabs>
           <w:tab w:val="right" w:pos="10512"/>
         </w:tabs>
-        <w:spacing w:before="40" w:after="10" w:line="246" w:lineRule="auto"/>
+        <w:spacing w:before="40" w:after="10" w:line="240" w:lineRule="auto"/>
       </w:pPr>
       <w:r>
         <w:rPr>
@@ -1053,7 +1053,7 @@
           <w:ilvl w:val="0"/>
           <w:numId w:val="1"/>
         </w:numPr>
-        <w:spacing w:before="0" w:after="8" w:line="246" w:lineRule="auto"/>
+        <w:spacing w:before="0" w:after="8" w:line="240" w:lineRule="auto"/>
       </w:pPr>
       <w:r>
         <w:rPr>
@@ -1068,7 +1068,7 @@
         <w:tabs>
           <w:tab w:val="right" w:pos="10512"/>
         </w:tabs>
-        <w:spacing w:before="40" w:after="10" w:line="246" w:lineRule="auto"/>
+        <w:spacing w:before="40" w:after="10" w:line="240" w:lineRule="auto"/>
       </w:pPr>
       <w:r>
         <w:rPr>
@@ -1110,7 +1110,7 @@
           <w:ilvl w:val="0"/>
           <w:numId w:val="1"/>
         </w:numPr>
-        <w:spacing w:before="0" w:after="8" w:line="246" w:lineRule="auto"/>
+        <w:spacing w:before="0" w:after="8" w:line="240" w:lineRule="auto"/>
       </w:pPr>
       <w:r>
         <w:rPr>
@@ -1121,24 +1121,24 @@
     </w:p>
     <w:p>
       <w:pPr>
-        <w:numPr>
-          <w:ilvl w:val="0"/>
-          <w:numId w:val="1"/>
-        </w:numPr>
-        <w:spacing w:before="0" w:after="8" w:line="246" w:lineRule="auto"/>
-      </w:pPr>
-      <w:r>
-        <w:rPr>
-          <w:rFonts w:ascii="Calibri" w:hAnsi="Calibri" w:cs="Calibri"/>
-          <w:b/>
-        </w:rPr>
-        <w:t xml:space="preserve">Also: </w:t>
-      </w:r>
-      <w:r>
-        <w:rPr>
-          <w:rFonts w:ascii="Calibri" w:hAnsi="Calibri" w:cs="Calibri"/>
-        </w:rPr>
-        <w:t xml:space="preserve">modal and epistemic logic primer for BDI agents (</w:t>
+        <w:keepNext/>
+        <w:tabs>
+          <w:tab w:val="right" w:pos="10512"/>
+        </w:tabs>
+        <w:spacing w:before="40" w:after="10" w:line="240" w:lineRule="auto"/>
+      </w:pPr>
+      <w:r>
+        <w:rPr>
+          <w:rFonts w:ascii="Calibri" w:hAnsi="Calibri" w:cs="Calibri"/>
+          <w:b/>
+        </w:rPr>
+        <w:t xml:space="preserve">A Primer on Modal and Epistemic Logic</w:t>
+      </w:r>
+      <w:r>
+        <w:rPr>
+          <w:rFonts w:ascii="Calibri" w:hAnsi="Calibri" w:cs="Calibri"/>
+        </w:rPr>
+        <w:t xml:space="preserve"> | </w:t>
       </w:r>
       <w:hyperlink r:id="rIdL8" w:history="1">
         <w:r>
@@ -1151,17 +1151,93 @@
         </w:r>
       </w:hyperlink>
       <w:r>
-        <w:rPr>
-          <w:rFonts w:ascii="Calibri" w:hAnsi="Calibri" w:cs="Calibri"/>
-        </w:rPr>
-        <w:t xml:space="preserve">); “Science &amp; Machine Intelligence” newsletter.</w:t>
+        <w:tab/>
+      </w:r>
+      <w:r>
+        <w:rPr>
+          <w:rFonts w:ascii="Calibri" w:hAnsi="Calibri" w:cs="Calibri"/>
+          <w:i/>
+        </w:rPr>
+        <w:t xml:space="preserve">2026</w:t>
+      </w:r>
+    </w:p>
+    <w:p>
+      <w:pPr>
+        <w:numPr>
+          <w:ilvl w:val="0"/>
+          <w:numId w:val="1"/>
+        </w:numPr>
+        <w:spacing w:before="0" w:after="8" w:line="240" w:lineRule="auto"/>
+      </w:pPr>
+      <w:r>
+        <w:rPr>
+          <w:rFonts w:ascii="Calibri" w:hAnsi="Calibri" w:cs="Calibri"/>
+        </w:rPr>
+        <w:t xml:space="preserve">Self-contained tutorial from propositional logic to modal and epistemic proofs about Belief-Desire-Intention (BDI) agents.</w:t>
+      </w:r>
+    </w:p>
+    <w:p>
+      <w:pPr>
+        <w:keepNext/>
+        <w:tabs>
+          <w:tab w:val="right" w:pos="10512"/>
+        </w:tabs>
+        <w:spacing w:before="40" w:after="10" w:line="240" w:lineRule="auto"/>
+      </w:pPr>
+      <w:r>
+        <w:rPr>
+          <w:rFonts w:ascii="Calibri" w:hAnsi="Calibri" w:cs="Calibri"/>
+          <w:b/>
+        </w:rPr>
+        <w:t xml:space="preserve">Science &amp; Machine Intelligence — LinkedIn newsletter</w:t>
+      </w:r>
+      <w:r>
+        <w:rPr>
+          <w:rFonts w:ascii="Calibri" w:hAnsi="Calibri" w:cs="Calibri"/>
+        </w:rPr>
+        <w:t xml:space="preserve"> | </w:t>
+      </w:r>
+      <w:hyperlink r:id="rIdL9" w:history="1">
+        <w:r>
+          <w:rPr>
+            <w:rFonts w:ascii="Calibri" w:hAnsi="Calibri" w:cs="Calibri"/>
+            <w:color w:val="0563C1"/>
+            <w:u w:val="single"/>
+          </w:rPr>
+          <w:t xml:space="preserve">Subscribe on LinkedIn</w:t>
+        </w:r>
+      </w:hyperlink>
+      <w:r>
+        <w:tab/>
+      </w:r>
+      <w:r>
+        <w:rPr>
+          <w:rFonts w:ascii="Calibri" w:hAnsi="Calibri" w:cs="Calibri"/>
+          <w:i/>
+        </w:rPr>
+        <w:t xml:space="preserve">Monthly</w:t>
+      </w:r>
+    </w:p>
+    <w:p>
+      <w:pPr>
+        <w:numPr>
+          <w:ilvl w:val="0"/>
+          <w:numId w:val="1"/>
+        </w:numPr>
+        <w:spacing w:before="0" w:after="8" w:line="240" w:lineRule="auto"/>
+      </w:pPr>
+      <w:r>
+        <w:rPr>
+          <w:rFonts w:ascii="Calibri" w:hAnsi="Calibri" w:cs="Calibri"/>
+        </w:rPr>
+        <w:t xml:space="preserve">Monthly newsletter (203 subscribers) on current boundaries and future trends in AI and scientific discovery.</w:t>
       </w:r>
     </w:p>
     <w:p>
       <w:pPr>
         <w:pStyle w:val="Heading1"/>
         <w:keepNext/>
-        <w:spacing w:before="130" w:after="45" w:line="246" w:lineRule="auto"/>
+        <w:spacing w:before="110" w:after="40" w:line="240" w:lineRule="auto"/>
       </w:pPr>
       <w:r>
         <w:rPr>
@@ -1176,7 +1252,7 @@
     </w:p>
     <w:p>
       <w:pPr>
-        <w:spacing w:before="0" w:after="12" w:line="246" w:lineRule="auto"/>
+        <w:spacing w:before="0" w:after="12" w:line="240" w:lineRule="auto"/>
       </w:pPr>
       <w:r>
         <w:rPr>
@@ -1202,7 +1278,7 @@
           <w:ilvl w:val="0"/>
           <w:numId w:val="1"/>
         </w:numPr>
-        <w:spacing w:before="0" w:after="8" w:line="246" w:lineRule="auto"/>
+        <w:spacing w:before="0" w:after="8" w:line="240" w:lineRule="auto"/>
       </w:pPr>
       <w:r>
         <w:rPr>
@@ -1224,7 +1300,7 @@
           <w:ilvl w:val="0"/>
           <w:numId w:val="1"/>
         </w:numPr>
-        <w:spacing w:before="0" w:after="8" w:line="246" w:lineRule="auto"/>
+        <w:spacing w:before="0" w:after="8" w:line="240" w:lineRule="auto"/>
       </w:pPr>
       <w:r>
         <w:rPr>
@@ -1244,7 +1320,7 @@
       <w:pPr>
         <w:pStyle w:val="Heading1"/>
         <w:keepNext/>
-        <w:spacing w:before="130" w:after="45" w:line="246" w:lineRule="auto"/>
+        <w:spacing w:before="110" w:after="40" w:line="240" w:lineRule="auto"/>
       </w:pPr>
       <w:r>
         <w:rPr>
@@ -1262,7 +1338,7 @@
         <w:tabs>
           <w:tab w:val="right" w:pos="10512"/>
         </w:tabs>
-        <w:spacing w:before="0" w:after="8" w:line="246" w:lineRule="auto"/>
+        <w:spacing w:before="0" w:after="8" w:line="240" w:lineRule="auto"/>
       </w:pPr>
       <w:r>
         <w:rPr>
@@ -1293,7 +1369,7 @@
         <w:tabs>
           <w:tab w:val="right" w:pos="10512"/>
         </w:tabs>
-        <w:spacing w:before="0" w:after="8" w:line="246" w:lineRule="auto"/>
+        <w:spacing w:before="0" w:after="8" w:line="240" w:lineRule="auto"/>
       </w:pPr>
       <w:r>
         <w:rPr>
@@ -1324,7 +1400,7 @@
         <w:tabs>
           <w:tab w:val="right" w:pos="10512"/>
         </w:tabs>
-        <w:spacing w:before="0" w:after="8" w:line="246" w:lineRule="auto"/>
+        <w:spacing w:before="0" w:after="8" w:line="240" w:lineRule="auto"/>
       </w:pPr>
       <w:r>
         <w:rPr>
@@ -1355,7 +1431,7 @@
         <w:tabs>
           <w:tab w:val="right" w:pos="10512"/>
         </w:tabs>
-        <w:spacing w:before="0" w:after="8" w:line="246" w:lineRule="auto"/>
+        <w:spacing w:before="0" w:after="8" w:line="240" w:lineRule="auto"/>
       </w:pPr>
       <w:r>
         <w:rPr>
@@ -1385,7 +1461,7 @@
       <w:pPr>
         <w:pStyle w:val="Heading1"/>
         <w:keepNext/>
-        <w:spacing w:before="130" w:after="45" w:line="246" w:lineRule="auto"/>
+        <w:spacing w:before="110" w:after="40" w:line="240" w:lineRule="auto"/>
       </w:pPr>
       <w:r>
         <w:rPr>
@@ -1400,7 +1476,7 @@
     </w:p>
     <w:p>
       <w:pPr>
-        <w:spacing w:before="0" w:after="12" w:line="246" w:lineRule="auto"/>
+        <w:spacing w:before="0" w:after="12" w:line="240" w:lineRule="auto"/>
       </w:pPr>
       <w:r>
         <w:rPr>
@@ -1418,7 +1494,7 @@
     </w:p>
     <w:p>
       <w:pPr>
-        <w:spacing w:before="0" w:after="0" w:line="246" w:lineRule="auto"/>
+        <w:spacing w:before="0" w:after="0" w:line="240" w:lineRule="auto"/>
       </w:pPr>
       <w:r>
         <w:rPr>
@@ -1438,7 +1514,7 @@
       <w:pPr>
         <w:pStyle w:val="Heading1"/>
         <w:keepNext/>
-        <w:spacing w:before="130" w:after="45" w:line="246" w:lineRule="auto"/>
+        <w:spacing w:before="110" w:after="40" w:line="240" w:lineRule="auto"/>
       </w:pPr>
       <w:r>
         <w:rPr>
@@ -1457,7 +1533,7 @@
           <w:ilvl w:val="0"/>
           <w:numId w:val="1"/>
         </w:numPr>
-        <w:spacing w:before="0" w:after="8" w:line="246" w:lineRule="auto"/>
+        <w:spacing w:before="0" w:after="8" w:line="240" w:lineRule="auto"/>
       </w:pPr>
       <w:r>
         <w:rPr>
@@ -1472,7 +1548,7 @@
           <w:ilvl w:val="0"/>
           <w:numId w:val="1"/>
         </w:numPr>
-        <w:spacing w:before="0" w:after="8" w:line="246" w:lineRule="auto"/>
+        <w:spacing w:before="0" w:after="8" w:line="240" w:lineRule="auto"/>
       </w:pPr>
       <w:r>
         <w:rPr>

</xml_diff>

<commit_message>
Resume: group Caltech and Cypress roles under Earlier Experience
The two oldest roles now share one undated "Earlier Experience" entry.

Co-Authored-By: Claude Sonnet 5.5 <noreply@anthropic.com>
</commit_message>
<xml_diff>
--- a/Joseph-Catanzarite-Resume-15Oct2026.docx
+++ b/Joseph-Catanzarite-Resume-15Oct2026.docx
@@ -852,99 +852,61 @@
           <w:rFonts w:ascii="Calibri" w:hAnsi="Calibri" w:cs="Calibri"/>
           <w:b/>
         </w:rPr>
-        <w:t xml:space="preserve">Senior Engineer and Senior Application Developer</w:t>
-      </w:r>
-      <w:r>
-        <w:rPr>
-          <w:rFonts w:ascii="Calibri" w:hAnsi="Calibri" w:cs="Calibri"/>
-        </w:rPr>
-        <w:t xml:space="preserve"> | California Institute of Technology</w:t>
-      </w:r>
-      <w:r>
-        <w:rPr>
-          <w:rFonts w:ascii="Calibri" w:hAnsi="Calibri" w:cs="Calibri"/>
-          <w:i/>
-        </w:rPr>
-        <w:t xml:space="preserve"> | Pasadena, CA</w:t>
-      </w:r>
-      <w:r>
-        <w:tab/>
-      </w:r>
-      <w:r>
-        <w:rPr>
-          <w:rFonts w:ascii="Calibri" w:hAnsi="Calibri" w:cs="Calibri"/>
-          <w:i/>
-        </w:rPr>
-        <w:t xml:space="preserve">Jan 1999 – Jan 2003</w:t>
-      </w:r>
-    </w:p>
-    <w:p>
-      <w:pPr>
-        <w:numPr>
-          <w:ilvl w:val="0"/>
-          <w:numId w:val="1"/>
-        </w:numPr>
-        <w:spacing w:before="0" w:after="8" w:line="240" w:lineRule="auto"/>
-      </w:pPr>
-      <w:r>
-        <w:rPr>
-          <w:rFonts w:ascii="Calibri" w:hAnsi="Calibri" w:cs="Calibri"/>
-        </w:rPr>
-        <w:t xml:space="preserve">Trade studies of astrometric performance versus instrument parameters; data analysis algorithms for SIM’s Micro-Arcsecond Metrology testbed; WIRE star-tracker data preprocessing for asteroseismology research.</w:t>
-      </w:r>
-    </w:p>
-    <w:p>
-      <w:pPr>
-        <w:keepNext/>
-        <w:tabs>
-          <w:tab w:val="right" w:pos="10512"/>
-        </w:tabs>
-        <w:spacing w:before="50" w:after="10" w:line="240" w:lineRule="auto"/>
-      </w:pPr>
-      <w:r>
-        <w:rPr>
-          <w:rFonts w:ascii="Calibri" w:hAnsi="Calibri" w:cs="Calibri"/>
-          <w:b/>
-        </w:rPr>
-        <w:t xml:space="preserve">Professor of Physics and Astronomy</w:t>
-      </w:r>
-      <w:r>
-        <w:rPr>
-          <w:rFonts w:ascii="Calibri" w:hAnsi="Calibri" w:cs="Calibri"/>
-        </w:rPr>
-        <w:t xml:space="preserve"> | Cypress College</w:t>
-      </w:r>
-      <w:r>
-        <w:rPr>
-          <w:rFonts w:ascii="Calibri" w:hAnsi="Calibri" w:cs="Calibri"/>
-          <w:i/>
-        </w:rPr>
-        <w:t xml:space="preserve"> | Cypress, CA</w:t>
-      </w:r>
-      <w:r>
-        <w:tab/>
-      </w:r>
-      <w:r>
-        <w:rPr>
-          <w:rFonts w:ascii="Calibri" w:hAnsi="Calibri" w:cs="Calibri"/>
-          <w:i/>
-        </w:rPr>
-        <w:t xml:space="preserve">Sep 1985 – 1999</w:t>
-      </w:r>
-    </w:p>
-    <w:p>
-      <w:pPr>
-        <w:numPr>
-          <w:ilvl w:val="0"/>
-          <w:numId w:val="1"/>
-        </w:numPr>
-        <w:spacing w:before="0" w:after="8" w:line="240" w:lineRule="auto"/>
-      </w:pPr>
-      <w:r>
-        <w:rPr>
-          <w:rFonts w:ascii="Calibri" w:hAnsi="Calibri" w:cs="Calibri"/>
-        </w:rPr>
-        <w:t xml:space="preserve">Chaired the Physical Sciences Department; developed and taught physics and astronomy courses (lecture and laboratory).</w:t>
+        <w:t xml:space="preserve">Earlier Experience</w:t>
+      </w:r>
+      <w:r>
+        <w:tab/>
+      </w:r>
+      <w:r>
+        <w:rPr>
+          <w:rFonts w:ascii="Calibri" w:hAnsi="Calibri" w:cs="Calibri"/>
+          <w:i/>
+        </w:rPr>
+        <w:t xml:space="preserve"/>
+      </w:r>
+    </w:p>
+    <w:p>
+      <w:pPr>
+        <w:numPr>
+          <w:ilvl w:val="0"/>
+          <w:numId w:val="1"/>
+        </w:numPr>
+        <w:spacing w:before="0" w:after="8" w:line="240" w:lineRule="auto"/>
+      </w:pPr>
+      <w:r>
+        <w:rPr>
+          <w:rFonts w:ascii="Calibri" w:hAnsi="Calibri" w:cs="Calibri"/>
+          <w:b/>
+        </w:rPr>
+        <w:t xml:space="preserve">Senior Engineer and Senior Application Developer, California Institute of Technology: </w:t>
+      </w:r>
+      <w:r>
+        <w:rPr>
+          <w:rFonts w:ascii="Calibri" w:hAnsi="Calibri" w:cs="Calibri"/>
+        </w:rPr>
+        <w:t xml:space="preserve">trade studies of astrometric performance; data analysis algorithms for SIM’s Micro-Arcsecond Metrology testbed; WIRE star-tracker data preprocessing for asteroseismology research.</w:t>
+      </w:r>
+    </w:p>
+    <w:p>
+      <w:pPr>
+        <w:numPr>
+          <w:ilvl w:val="0"/>
+          <w:numId w:val="1"/>
+        </w:numPr>
+        <w:spacing w:before="0" w:after="8" w:line="240" w:lineRule="auto"/>
+      </w:pPr>
+      <w:r>
+        <w:rPr>
+          <w:rFonts w:ascii="Calibri" w:hAnsi="Calibri" w:cs="Calibri"/>
+          <w:b/>
+        </w:rPr>
+        <w:t xml:space="preserve">Professor of Physics and Astronomy, Cypress College: </w:t>
+      </w:r>
+      <w:r>
+        <w:rPr>
+          <w:rFonts w:ascii="Calibri" w:hAnsi="Calibri" w:cs="Calibri"/>
+        </w:rPr>
+        <w:t xml:space="preserve">chaired the Physical Sciences Department; developed and taught physics and astronomy courses (lecture and laboratory).</w:t>
       </w:r>
     </w:p>
     <w:p>

</xml_diff>

<commit_message>
Resume: spell out acronyms at first use
Every acronym is now expanded the first time it appears (NASA, JPL, SETI,
DR24, SIM, WIRE, LLMs, CNNs, SQL, SVN, journal names, and others). To keep
the resume at two pages, drop the Teaching & Leadership skills line, two
certifications, and one Kepler journal entry.

Co-Authored-By: Claude Sonnet 5.5 <noreply@anthropic.com>
</commit_message>
<xml_diff>
--- a/Joseph-Catanzarite-Resume-15Oct2026.docx
+++ b/Joseph-Catanzarite-Resume-15Oct2026.docx
@@ -30,7 +30,7 @@
           <w:sz w:val="22"/>
           <w:szCs w:val="22"/>
         </w:rPr>
-        <w:t xml:space="preserve">AI Researcher  |  Data Scientist  |  Machine Learning, LLMs &amp; Astrophysics</w:t>
+        <w:t xml:space="preserve">Artificial Intelligence Researcher  |  Data Scientist  |  Machine Learning &amp; Astrophysics</w:t>
       </w:r>
     </w:p>
     <w:p>
@@ -123,7 +123,7 @@
       <w:pPr>
         <w:pStyle w:val="Heading1"/>
         <w:keepNext/>
-        <w:spacing w:before="110" w:after="40" w:line="240" w:lineRule="auto"/>
+        <w:spacing w:before="100" w:after="40" w:line="240" w:lineRule="auto"/>
       </w:pPr>
       <w:r>
         <w:rPr>
@@ -144,14 +144,14 @@
         <w:rPr>
           <w:rFonts w:ascii="Calibri" w:hAnsi="Calibri" w:cs="Calibri"/>
         </w:rPr>
-        <w:t xml:space="preserve">AI researcher and data scientist with extensive experience applying machine learning, Bayesian statistics, and scientific computing to NASA missions and teaching. Built a Random Forest classifier (97% accuracy) for Kepler exoplanet candidate vetting, published in NASA’s DR24 catalog; led JPL’s analysis team in a five-team double-blind exoplanet detection test. Completing an M.S. in Artificial Intelligence at Johns Hopkins (expected 2028) with hands-on work in large language models (LLMs), generative AI, and AI agents. Author of peer-reviewed astrophysics papers (~5,900 citations, h-index 32). Instructor and research mentor in AI, data science, physics, and astronomy.</w:t>
+        <w:t xml:space="preserve">Artificial intelligence (AI) researcher and data scientist with experience applying machine learning, Bayesian statistics, and scientific computing to National Aeronautics and Space Administration (NASA) missions and teaching. Built a Random Forest classifier (97% accuracy) for Kepler exoplanet candidate vetting, published in NASA’s Kepler Data Release 24 (DR24) catalog; led the Jet Propulsion Laboratory (JPL) analysis team in a five-team double-blind exoplanet detection test. Completing an M.S. in Artificial Intelligence at Johns Hopkins (expected 2028) with work in large language models (LLMs), generative AI, and AI agents. Author of peer-reviewed papers (~5,900 citations, h-index 32). Instructor and research mentor in AI, data science, physics, and astronomy.</w:t>
       </w:r>
     </w:p>
     <w:p>
       <w:pPr>
         <w:pStyle w:val="Heading1"/>
         <w:keepNext/>
-        <w:spacing w:before="110" w:after="40" w:line="240" w:lineRule="auto"/>
+        <w:spacing w:before="100" w:after="40" w:line="240" w:lineRule="auto"/>
       </w:pPr>
       <w:r>
         <w:rPr>
@@ -179,7 +179,7 @@
         <w:rPr>
           <w:rFonts w:ascii="Calibri" w:hAnsi="Calibri" w:cs="Calibri"/>
         </w:rPr>
-        <w:t xml:space="preserve">Large Language Models (LLMs), Generative AI, AI Agents, Deep Learning, Neural Networks (CNN, VAE, GAN), Natural Language Processing (NLP), Computer Vision, Supervised Learning, Random Forest, k-Nearest Neighbors, Model Training &amp; Evaluation, LLMOps, Claude (Anthropic)</w:t>
+        <w:t xml:space="preserve">Large Language Models (LLMs), Generative AI, AI Agents, Deep Learning, Convolutional Neural Networks (CNNs), Variational Autoencoders (VAEs), Generative Adversarial Networks (GANs), Natural Language Processing (NLP), Computer Vision, Supervised Learning, Random Forest, k-Nearest Neighbors, Model Training &amp; Evaluation, Large Language Model Operations (LLMOps), Claude (Anthropic)</w:t>
       </w:r>
     </w:p>
     <w:p>
@@ -233,32 +233,14 @@
         <w:rPr>
           <w:rFonts w:ascii="Calibri" w:hAnsi="Calibri" w:cs="Calibri"/>
         </w:rPr>
-        <w:t xml:space="preserve">Python, MATLAB, SQL, PyTorch, TensorFlow, Keras, fastai, scikit-learn, NumPy, pandas, Jupyter, Git/GitHub, SVN, Google Cloud Platform</w:t>
-      </w:r>
-    </w:p>
-    <w:p>
-      <w:pPr>
-        <w:spacing w:before="0" w:after="12" w:line="240" w:lineRule="auto"/>
-      </w:pPr>
-      <w:r>
-        <w:rPr>
-          <w:rFonts w:ascii="Calibri" w:hAnsi="Calibri" w:cs="Calibri"/>
-          <w:b/>
-        </w:rPr>
-        <w:t xml:space="preserve">Teaching &amp; Leadership: </w:t>
-      </w:r>
-      <w:r>
-        <w:rPr>
-          <w:rFonts w:ascii="Calibri" w:hAnsi="Calibri" w:cs="Calibri"/>
-        </w:rPr>
-        <w:t xml:space="preserve">Curriculum Development, Teaching &amp; Mentoring, Research Mentorship, Technical Writing</w:t>
+        <w:t xml:space="preserve">Python, MATLAB, Structured Query Language (SQL), PyTorch, TensorFlow, Keras, fastai, scikit-learn, NumPy, pandas, Jupyter, Git/GitHub, Subversion (SVN), Google Cloud Platform</w:t>
       </w:r>
     </w:p>
     <w:p>
       <w:pPr>
         <w:pStyle w:val="Heading1"/>
         <w:keepNext/>
-        <w:spacing w:before="110" w:after="40" w:line="240" w:lineRule="auto"/>
+        <w:spacing w:before="100" w:after="40" w:line="240" w:lineRule="auto"/>
       </w:pPr>
       <w:r>
         <w:rPr>
@@ -316,7 +298,7 @@
           <w:ilvl w:val="0"/>
           <w:numId w:val="1"/>
         </w:numPr>
-        <w:spacing w:before="0" w:after="8" w:line="240" w:lineRule="auto"/>
+        <w:spacing w:before="0" w:after="5" w:line="240" w:lineRule="auto"/>
       </w:pPr>
       <w:r>
         <w:rPr>
@@ -370,7 +352,7 @@
           <w:ilvl w:val="0"/>
           <w:numId w:val="1"/>
         </w:numPr>
-        <w:spacing w:before="0" w:after="8" w:line="240" w:lineRule="auto"/>
+        <w:spacing w:before="0" w:after="5" w:line="240" w:lineRule="auto"/>
       </w:pPr>
       <w:r>
         <w:rPr>
@@ -424,7 +406,7 @@
           <w:ilvl w:val="0"/>
           <w:numId w:val="1"/>
         </w:numPr>
-        <w:spacing w:before="0" w:after="8" w:line="240" w:lineRule="auto"/>
+        <w:spacing w:before="0" w:after="5" w:line="240" w:lineRule="auto"/>
       </w:pPr>
       <w:r>
         <w:rPr>
@@ -510,7 +492,7 @@
           <w:ilvl w:val="0"/>
           <w:numId w:val="1"/>
         </w:numPr>
-        <w:spacing w:before="0" w:after="8" w:line="240" w:lineRule="auto"/>
+        <w:spacing w:before="0" w:after="5" w:line="240" w:lineRule="auto"/>
       </w:pPr>
       <w:r>
         <w:rPr>
@@ -564,7 +546,7 @@
           <w:ilvl w:val="0"/>
           <w:numId w:val="1"/>
         </w:numPr>
-        <w:spacing w:before="0" w:after="8" w:line="240" w:lineRule="auto"/>
+        <w:spacing w:before="0" w:after="5" w:line="240" w:lineRule="auto"/>
       </w:pPr>
       <w:r>
         <w:rPr>
@@ -611,7 +593,7 @@
           <w:ilvl w:val="0"/>
           <w:numId w:val="1"/>
         </w:numPr>
-        <w:spacing w:before="0" w:after="8" w:line="240" w:lineRule="auto"/>
+        <w:spacing w:before="0" w:after="5" w:line="240" w:lineRule="auto"/>
       </w:pPr>
       <w:r>
         <w:rPr>
@@ -633,7 +615,7 @@
           <w:ilvl w:val="0"/>
           <w:numId w:val="1"/>
         </w:numPr>
-        <w:spacing w:before="0" w:after="8" w:line="240" w:lineRule="auto"/>
+        <w:spacing w:before="0" w:after="5" w:line="240" w:lineRule="auto"/>
       </w:pPr>
       <w:r>
         <w:rPr>
@@ -655,14 +637,14 @@
           <w:ilvl w:val="0"/>
           <w:numId w:val="1"/>
         </w:numPr>
-        <w:spacing w:before="0" w:after="8" w:line="240" w:lineRule="auto"/>
-      </w:pPr>
-      <w:r>
-        <w:rPr>
-          <w:rFonts w:ascii="Calibri" w:hAnsi="Calibri" w:cs="Calibri"/>
-          <w:b/>
-        </w:rPr>
-        <w:t xml:space="preserve">Fast.ai International Fellow, USF (2018–2020): </w:t>
+        <w:spacing w:before="0" w:after="5" w:line="240" w:lineRule="auto"/>
+      </w:pPr>
+      <w:r>
+        <w:rPr>
+          <w:rFonts w:ascii="Calibri" w:hAnsi="Calibri" w:cs="Calibri"/>
+          <w:b/>
+        </w:rPr>
+        <w:t xml:space="preserve">Fast.ai International Fellow, University of San Francisco (2018–2020): </w:t>
       </w:r>
       <w:r>
         <w:rPr>
@@ -684,13 +666,13 @@
           <w:rFonts w:ascii="Calibri" w:hAnsi="Calibri" w:cs="Calibri"/>
           <w:b/>
         </w:rPr>
-        <w:t xml:space="preserve">Data Scientist – NASA Kepler Mission Science Office</w:t>
-      </w:r>
-      <w:r>
-        <w:rPr>
-          <w:rFonts w:ascii="Calibri" w:hAnsi="Calibri" w:cs="Calibri"/>
-        </w:rPr>
-        <w:t xml:space="preserve"> | SETI Institute</w:t>
+        <w:t xml:space="preserve">Data Scientist</w:t>
+      </w:r>
+      <w:r>
+        <w:rPr>
+          <w:rFonts w:ascii="Calibri" w:hAnsi="Calibri" w:cs="Calibri"/>
+        </w:rPr>
+        <w:t xml:space="preserve"> | Search for Extraterrestrial Intelligence (SETI) Institute</w:t>
       </w:r>
       <w:r>
         <w:rPr>
@@ -716,22 +698,22 @@
           <w:ilvl w:val="0"/>
           <w:numId w:val="1"/>
         </w:numPr>
-        <w:spacing w:before="0" w:after="8" w:line="240" w:lineRule="auto"/>
-      </w:pPr>
-      <w:r>
-        <w:rPr>
-          <w:rFonts w:ascii="Calibri" w:hAnsi="Calibri" w:cs="Calibri"/>
-        </w:rPr>
-        <w:t xml:space="preserve">As astronomer and scientific programmer, built a Random Forest “autovetter” that classifies Kepler exoplanet candidates with 97% accuracy; published in NASA’s Kepler DR24 catalog and documented in the Autovetter Planet Candidate Catalog report.</w:t>
-      </w:r>
-    </w:p>
-    <w:p>
-      <w:pPr>
-        <w:numPr>
-          <w:ilvl w:val="0"/>
-          <w:numId w:val="1"/>
-        </w:numPr>
-        <w:spacing w:before="0" w:after="8" w:line="240" w:lineRule="auto"/>
+        <w:spacing w:before="0" w:after="5" w:line="240" w:lineRule="auto"/>
+      </w:pPr>
+      <w:r>
+        <w:rPr>
+          <w:rFonts w:ascii="Calibri" w:hAnsi="Calibri" w:cs="Calibri"/>
+        </w:rPr>
+        <w:t xml:space="preserve">As astronomer and scientific programmer attached to NASA’s Kepler Mission Science Office, built a Random Forest “autovetter” that classifies Kepler exoplanet candidates with 97% accuracy; published in the DR24 catalog.</w:t>
+      </w:r>
+    </w:p>
+    <w:p>
+      <w:pPr>
+        <w:numPr>
+          <w:ilvl w:val="0"/>
+          <w:numId w:val="1"/>
+        </w:numPr>
+        <w:spacing w:before="0" w:after="5" w:line="240" w:lineRule="auto"/>
       </w:pPr>
       <w:r>
         <w:rPr>
@@ -746,7 +728,7 @@
           <w:ilvl w:val="0"/>
           <w:numId w:val="1"/>
         </w:numPr>
-        <w:spacing w:before="0" w:after="8" w:line="240" w:lineRule="auto"/>
+        <w:spacing w:before="0" w:after="5" w:line="240" w:lineRule="auto"/>
       </w:pPr>
       <w:r>
         <w:rPr>
@@ -800,22 +782,22 @@
           <w:ilvl w:val="0"/>
           <w:numId w:val="1"/>
         </w:numPr>
-        <w:spacing w:before="0" w:after="8" w:line="240" w:lineRule="auto"/>
-      </w:pPr>
-      <w:r>
-        <w:rPr>
-          <w:rFonts w:ascii="Calibri" w:hAnsi="Calibri" w:cs="Calibri"/>
-        </w:rPr>
-        <w:t xml:space="preserve">As an astronomer on the SIM planet-finding team, led JPL’s Analysis Team in NASA’s double-blind test for the Space Interferometry Mission (SIM), coordinating five teams to reach consensus solutions for planet masses and orbits from joint astrometric and radial velocity data.</w:t>
-      </w:r>
-    </w:p>
-    <w:p>
-      <w:pPr>
-        <w:numPr>
-          <w:ilvl w:val="0"/>
-          <w:numId w:val="1"/>
-        </w:numPr>
-        <w:spacing w:before="0" w:after="8" w:line="240" w:lineRule="auto"/>
+        <w:spacing w:before="0" w:after="5" w:line="240" w:lineRule="auto"/>
+      </w:pPr>
+      <w:r>
+        <w:rPr>
+          <w:rFonts w:ascii="Calibri" w:hAnsi="Calibri" w:cs="Calibri"/>
+        </w:rPr>
+        <w:t xml:space="preserve">As an astronomer on the Space Interferometry Mission (SIM) planet-finding team, led JPL’s Analysis Team in NASA’s double-blind test, coordinating five teams to reach consensus solutions from joint astrometric and radial velocity data.</w:t>
+      </w:r>
+    </w:p>
+    <w:p>
+      <w:pPr>
+        <w:numPr>
+          <w:ilvl w:val="0"/>
+          <w:numId w:val="1"/>
+        </w:numPr>
+        <w:spacing w:before="0" w:after="5" w:line="240" w:lineRule="auto"/>
       </w:pPr>
       <w:r>
         <w:rPr>
@@ -830,7 +812,7 @@
           <w:ilvl w:val="0"/>
           <w:numId w:val="1"/>
         </w:numPr>
-        <w:spacing w:before="0" w:after="8" w:line="240" w:lineRule="auto"/>
+        <w:spacing w:before="0" w:after="5" w:line="240" w:lineRule="auto"/>
       </w:pPr>
       <w:r>
         <w:rPr>
@@ -871,7 +853,7 @@
           <w:ilvl w:val="0"/>
           <w:numId w:val="1"/>
         </w:numPr>
-        <w:spacing w:before="0" w:after="8" w:line="240" w:lineRule="auto"/>
+        <w:spacing w:before="0" w:after="5" w:line="240" w:lineRule="auto"/>
       </w:pPr>
       <w:r>
         <w:rPr>
@@ -884,16 +866,16 @@
         <w:rPr>
           <w:rFonts w:ascii="Calibri" w:hAnsi="Calibri" w:cs="Calibri"/>
         </w:rPr>
-        <w:t xml:space="preserve">trade studies of astrometric performance; data analysis algorithms for SIM’s Micro-Arcsecond Metrology testbed; WIRE star-tracker data preprocessing for asteroseismology research.</w:t>
-      </w:r>
-    </w:p>
-    <w:p>
-      <w:pPr>
-        <w:numPr>
-          <w:ilvl w:val="0"/>
-          <w:numId w:val="1"/>
-        </w:numPr>
-        <w:spacing w:before="0" w:after="8" w:line="240" w:lineRule="auto"/>
+        <w:t xml:space="preserve">astrometric trade studies; SIM Micro-Arcsecond Metrology testbed analysis; Wide Field Infrared Explorer (WIRE) star-tracker data.</w:t>
+      </w:r>
+    </w:p>
+    <w:p>
+      <w:pPr>
+        <w:numPr>
+          <w:ilvl w:val="0"/>
+          <w:numId w:val="1"/>
+        </w:numPr>
+        <w:spacing w:before="0" w:after="5" w:line="240" w:lineRule="auto"/>
       </w:pPr>
       <w:r>
         <w:rPr>
@@ -913,7 +895,7 @@
       <w:pPr>
         <w:pStyle w:val="Heading1"/>
         <w:keepNext/>
-        <w:spacing w:before="110" w:after="40" w:line="240" w:lineRule="auto"/>
+        <w:spacing w:before="100" w:after="40" w:line="240" w:lineRule="auto"/>
       </w:pPr>
       <w:r>
         <w:rPr>
@@ -974,7 +956,7 @@
           <w:ilvl w:val="0"/>
           <w:numId w:val="1"/>
         </w:numPr>
-        <w:spacing w:before="0" w:after="8" w:line="240" w:lineRule="auto"/>
+        <w:spacing w:before="0" w:after="5" w:line="240" w:lineRule="auto"/>
       </w:pPr>
       <w:r>
         <w:rPr>
@@ -1015,13 +997,13 @@
           <w:ilvl w:val="0"/>
           <w:numId w:val="1"/>
         </w:numPr>
-        <w:spacing w:before="0" w:after="8" w:line="240" w:lineRule="auto"/>
-      </w:pPr>
-      <w:r>
-        <w:rPr>
-          <w:rFonts w:ascii="Calibri" w:hAnsi="Calibri" w:cs="Calibri"/>
-        </w:rPr>
-        <w:t xml:space="preserve">Compared Conditional VAE, Conditional GAN, and hybrid C-VAEGAN generative data augmentation on Chinese-MNIST (FID, SSIM, LPIPS, downstream CNN accuracy); designed a novel two-stage quality filter for synthetic samples.</w:t>
+        <w:spacing w:before="0" w:after="5" w:line="240" w:lineRule="auto"/>
+      </w:pPr>
+      <w:r>
+        <w:rPr>
+          <w:rFonts w:ascii="Calibri" w:hAnsi="Calibri" w:cs="Calibri"/>
+        </w:rPr>
+        <w:t xml:space="preserve">Compared conditional VAE, conditional GAN, and hybrid VAE-GAN (C-VAEGAN) generative data augmentation on Chinese-MNIST, scored with Fréchet Inception Distance (FID), Structural Similarity Index (SSIM), Learned Perceptual Image Patch Similarity (LPIPS), and downstream CNN accuracy; designed a novel two-stage quality filter for synthetic samples.</w:t>
       </w:r>
     </w:p>
     <w:p>
@@ -1037,7 +1019,7 @@
           <w:rFonts w:ascii="Calibri" w:hAnsi="Calibri" w:cs="Calibri"/>
           <w:b/>
         </w:rPr>
-        <w:t xml:space="preserve">Shots, Not Stars! 2026 FIFA World Cup Prediction Model</w:t>
+        <w:t xml:space="preserve">Shots, Not Stars! 2026 World Cup Prediction Model</w:t>
       </w:r>
       <w:r>
         <w:rPr>
@@ -1052,7 +1034,7 @@
             <w:color w:val="0563C1"/>
             <w:u w:val="single"/>
           </w:rPr>
-          <w:t xml:space="preserve">jcatanza.github.io/FIFA-World-Cup-2026-Predictions</w:t>
+          <w:t xml:space="preserve">View project page</w:t>
         </w:r>
       </w:hyperlink>
       <w:r>
@@ -1072,13 +1054,13 @@
           <w:ilvl w:val="0"/>
           <w:numId w:val="1"/>
         </w:numPr>
-        <w:spacing w:before="0" w:after="8" w:line="240" w:lineRule="auto"/>
-      </w:pPr>
-      <w:r>
-        <w:rPr>
-          <w:rFonts w:ascii="Calibri" w:hAnsi="Calibri" w:cs="Calibri"/>
-        </w:rPr>
-        <w:t xml:space="preserve">Random Forest on 17 team-level statistics from 67 matches with bootstrap confidence estimates; 62% win probability for Spain closely matched Polymarket; shots and saves were the top predictors.</w:t>
+        <w:spacing w:before="0" w:after="5" w:line="240" w:lineRule="auto"/>
+      </w:pPr>
+      <w:r>
+        <w:rPr>
+          <w:rFonts w:ascii="Calibri" w:hAnsi="Calibri" w:cs="Calibri"/>
+        </w:rPr>
+        <w:t xml:space="preserve">Random Forest and bootstrap sampling on 17 team-level statistics from 67 Fédération Internationale de Football Association (FIFA) World Cup matches; 62% win probability for Spain closely matched Polymarket.</w:t>
       </w:r>
     </w:p>
     <w:p>
@@ -1129,7 +1111,7 @@
           <w:ilvl w:val="0"/>
           <w:numId w:val="1"/>
         </w:numPr>
-        <w:spacing w:before="0" w:after="8" w:line="240" w:lineRule="auto"/>
+        <w:spacing w:before="0" w:after="5" w:line="240" w:lineRule="auto"/>
       </w:pPr>
       <w:r>
         <w:rPr>
@@ -1186,7 +1168,7 @@
           <w:ilvl w:val="0"/>
           <w:numId w:val="1"/>
         </w:numPr>
-        <w:spacing w:before="0" w:after="8" w:line="240" w:lineRule="auto"/>
+        <w:spacing w:before="0" w:after="5" w:line="240" w:lineRule="auto"/>
       </w:pPr>
       <w:r>
         <w:rPr>
@@ -1199,7 +1181,7 @@
       <w:pPr>
         <w:pStyle w:val="Heading1"/>
         <w:keepNext/>
-        <w:spacing w:before="110" w:after="40" w:line="240" w:lineRule="auto"/>
+        <w:spacing w:before="100" w:after="40" w:line="240" w:lineRule="auto"/>
       </w:pPr>
       <w:r>
         <w:rPr>
@@ -1240,7 +1222,7 @@
           <w:ilvl w:val="0"/>
           <w:numId w:val="1"/>
         </w:numPr>
-        <w:spacing w:before="0" w:after="8" w:line="240" w:lineRule="auto"/>
+        <w:spacing w:before="0" w:after="5" w:line="240" w:lineRule="auto"/>
       </w:pPr>
       <w:r>
         <w:rPr>
@@ -1253,16 +1235,16 @@
         <w:rPr>
           <w:rFonts w:ascii="Calibri" w:hAnsi="Calibri" w:cs="Calibri"/>
         </w:rPr>
-        <w:t xml:space="preserve">“Catching Up with the Fastest Star in the Galaxy: A Two-Passage GRAVITY+ Campaign to Detect S301’s Schwarzschild Precession,” arXiv:2609.06936 (2026), submitted to PASP; Catanzarite &amp; Shao, “The Occurrence Rate of Earth Analog Planets Orbiting Sun-like Stars,” ApJ 738, 151 (2011); “Astrometric Detection of Terrestrial Planets in the Habitable Zones of Nearby Stars with SIM PlanetQuest,” PASP 118, 1319 (2006).</w:t>
-      </w:r>
-    </w:p>
-    <w:p>
-      <w:pPr>
-        <w:numPr>
-          <w:ilvl w:val="0"/>
-          <w:numId w:val="1"/>
-        </w:numPr>
-        <w:spacing w:before="0" w:after="8" w:line="240" w:lineRule="auto"/>
+        <w:t xml:space="preserve">“Catching Up with the Fastest Star in the Galaxy: A Two-Passage GRAVITY+ Campaign to Detect S301’s Schwarzschild Precession,” arXiv:2609.06936 (2026), submitted to Publications of the Astronomical Society of the Pacific (PASP); Catanzarite &amp; Shao, “The Occurrence Rate of Earth Analog Planets Orbiting Sun-like Stars,” The Astrophysical Journal (ApJ) 738, 151 (2011); “Astrometric Detection of Terrestrial Planets in the Habitable Zones of Nearby Stars with SIM PlanetQuest,” PASP 118, 1319 (2006).</w:t>
+      </w:r>
+    </w:p>
+    <w:p>
+      <w:pPr>
+        <w:numPr>
+          <w:ilvl w:val="0"/>
+          <w:numId w:val="1"/>
+        </w:numPr>
+        <w:spacing w:before="0" w:after="5" w:line="240" w:lineRule="auto"/>
       </w:pPr>
       <w:r>
         <w:rPr>
@@ -1275,14 +1257,14 @@
         <w:rPr>
           <w:rFonts w:ascii="Calibri" w:hAnsi="Calibri" w:cs="Calibri"/>
         </w:rPr>
-        <w:t xml:space="preserve">PASP 126 (2014), wavelet error correction; ApJ 809 (2015), planet occurrence rates; AJ 150 (2015), Kepler-452b; ApJS 224 (2016), planet candidate catalog; PASP 130 (2018), Data Validation; AJ 161 (2021), rocky habitable-zone planets.</w:t>
+        <w:t xml:space="preserve">PASP 126 (2014), wavelet error correction; ApJ 809 (2015), planet occurrence rates; The Astronomical Journal (AJ) 150 (2015), Kepler-452b; PASP 130 (2018), Data Validation; AJ 161 (2021), rocky habitable-zone planets.</w:t>
       </w:r>
     </w:p>
     <w:p>
       <w:pPr>
         <w:pStyle w:val="Heading1"/>
         <w:keepNext/>
-        <w:spacing w:before="110" w:after="40" w:line="240" w:lineRule="auto"/>
+        <w:spacing w:before="100" w:after="40" w:line="240" w:lineRule="auto"/>
       </w:pPr>
       <w:r>
         <w:rPr>
@@ -1423,7 +1405,7 @@
       <w:pPr>
         <w:pStyle w:val="Heading1"/>
         <w:keepNext/>
-        <w:spacing w:before="110" w:after="40" w:line="240" w:lineRule="auto"/>
+        <w:spacing w:before="100" w:after="40" w:line="240" w:lineRule="auto"/>
       </w:pPr>
       <w:r>
         <w:rPr>
@@ -1445,13 +1427,13 @@
           <w:rFonts w:ascii="Calibri" w:hAnsi="Calibri" w:cs="Calibri"/>
           <w:b/>
         </w:rPr>
-        <w:t xml:space="preserve">Deep learning &amp; ML: </w:t>
-      </w:r>
-      <w:r>
-        <w:rPr>
-          <w:rFonts w:ascii="Calibri" w:hAnsi="Calibri" w:cs="Calibri"/>
-        </w:rPr>
-        <w:t xml:space="preserve">Practical Deep Learning for Coders 1 &amp; 2 (fast.ai/USF, 2018); Deep Learning Specialization (deeplearning.ai, 2018); Machine Learning Specialization (U. Washington, 2017); Foundations of Statistical ML (ASU, 2018); TensorFlow 2 (Imperial College London, 2021); Machine Learning on Google Cloud (2018).</w:t>
+        <w:t xml:space="preserve">Deep learning &amp; machine learning: </w:t>
+      </w:r>
+      <w:r>
+        <w:rPr>
+          <w:rFonts w:ascii="Calibri" w:hAnsi="Calibri" w:cs="Calibri"/>
+        </w:rPr>
+        <w:t xml:space="preserve">Practical Deep Learning for Coders 1 &amp; 2 (fast.ai, University of San Francisco, 2018); Deep Learning Specialization (deeplearning.ai, 2018); Machine Learning Specialization (University of Washington, 2017); Foundations of Statistical Machine Learning (Arizona State University, 2018); TensorFlow 2 (Imperial College London, 2021).</w:t>
       </w:r>
     </w:p>
     <w:p>
@@ -1469,14 +1451,14 @@
         <w:rPr>
           <w:rFonts w:ascii="Calibri" w:hAnsi="Calibri" w:cs="Calibri"/>
         </w:rPr>
-        <w:t xml:space="preserve">Learning from Data (Caltech); Convex Optimization (Stanford); Probability (MIT/edX); Causal Inference (Penn); SQL (UC Davis); Python for Research (HarvardX).</w:t>
+        <w:t xml:space="preserve">Learning from Data (Caltech); Convex Optimization (Stanford); Causal Inference (University of Pennsylvania); SQL for Data Science (University of California, Davis); Python for Research (HarvardX).</w:t>
       </w:r>
     </w:p>
     <w:p>
       <w:pPr>
         <w:pStyle w:val="Heading1"/>
         <w:keepNext/>
-        <w:spacing w:before="110" w:after="40" w:line="240" w:lineRule="auto"/>
+        <w:spacing w:before="100" w:after="40" w:line="240" w:lineRule="auto"/>
       </w:pPr>
       <w:r>
         <w:rPr>
@@ -1495,7 +1477,7 @@
           <w:ilvl w:val="0"/>
           <w:numId w:val="1"/>
         </w:numPr>
-        <w:spacing w:before="0" w:after="8" w:line="240" w:lineRule="auto"/>
+        <w:spacing w:before="0" w:after="5" w:line="240" w:lineRule="auto"/>
       </w:pPr>
       <w:r>
         <w:rPr>
@@ -1510,13 +1492,13 @@
           <w:ilvl w:val="0"/>
           <w:numId w:val="1"/>
         </w:numPr>
-        <w:spacing w:before="0" w:after="8" w:line="240" w:lineRule="auto"/>
-      </w:pPr>
-      <w:r>
-        <w:rPr>
-          <w:rFonts w:ascii="Calibri" w:hAnsi="Calibri" w:cs="Calibri"/>
-        </w:rPr>
-        <w:t xml:space="preserve">NASA JOVE Research Fellowship; NASA Summer Faculty Fellowship; USC Rockwell Fellowship; NISOD Excellence Award; Cypress College Faculty Development Award</w:t>
+        <w:spacing w:before="0" w:after="5" w:line="240" w:lineRule="auto"/>
+      </w:pPr>
+      <w:r>
+        <w:rPr>
+          <w:rFonts w:ascii="Calibri" w:hAnsi="Calibri" w:cs="Calibri"/>
+        </w:rPr>
+        <w:t xml:space="preserve">NASA/University Joint Venture (JOVE) Research Fellowship; NASA Summer Faculty Fellowship; National Institute for Staff and Organizational Development (NISOD) Excellence Award; Cypress College Faculty Development Award</w:t>
       </w:r>
     </w:p>
     <w:sectPr>

</xml_diff>